<commit_message>
fix(ocr): soporte multidireccional (0, 90, 180, 270 grados), normalizacion de caracteres termicos y realce de contraste para fotos en papel fisico
</commit_message>
<xml_diff>
--- a/INFORME_TECNICO_KIMBY_QC_ULSA_2026.docx
+++ b/INFORME_TECNICO_KIMBY_QC_ULSA_2026.docx
@@ -247,7 +247,7 @@
           <w:color w:val="000000"/>
           <w:sz w:val="26"/>
         </w:rPr>
-        <w:t>FACULTAD DE INGENIERÍA • INGENIERÍA MECATRÓNICA</w:t>
+        <w:t>RESOLUCIÓN DE ESTUDIO DE CASO</w:t>
       </w:r>
     </w:p>
     <w:p>
@@ -267,7 +267,7 @@
           <w:color w:val="000000"/>
           <w:sz w:val="27"/>
         </w:rPr>
-        <w:t>RESOLUCIÓN DE CASO DE ESTUDIO: SISTEMA AUTOMATIZADO DE INSPECCIÓN EN LÍNEA Y CONTROL DE CALIDAD POR RECONOCIMIENTO ÓPTICO DE CARACTERES (OCR)</w:t>
+        <w:t>SISTEMA AUTOMATIZADO DE INSPECCIÓN EN LÍNEA Y CONTROL DE CALIDAD POR RECONOCIMIENTO ÓPTICO DE CARACTERES (OCR)</w:t>
         <w:br/>
         <w:t>CASO 1: EMBUTIDOS KIMBY</w:t>
       </w:r>
@@ -370,7 +370,7 @@
           <w:rFonts w:ascii="Arial" w:hAnsi="Arial"/>
           <w:b w:val="0"/>
           <w:color w:val="000000"/>
-          <w:sz w:val="24"/>
+          <w:sz w:val="23"/>
         </w:rPr>
         <w:t>Emilio Rafael Rojas Molinares</w:t>
       </w:r>
@@ -384,7 +384,15 @@
           <w:szCs w:val="28"/>
         </w:rPr>
       </w:pPr>
-      <w:r/>
+      <w:r>
+        <w:rPr>
+          <w:rFonts w:ascii="Arial" w:hAnsi="Arial"/>
+          <w:b w:val="0"/>
+          <w:color w:val="000000"/>
+          <w:sz w:val="23"/>
+        </w:rPr>
+        <w:t>Francini Rocío</w:t>
+      </w:r>
     </w:p>
     <w:p>
       <w:pPr>
@@ -394,7 +402,15 @@
           <w:b/>
         </w:rPr>
       </w:pPr>
-      <w:r/>
+      <w:r>
+        <w:rPr>
+          <w:rFonts w:ascii="Arial" w:hAnsi="Arial"/>
+          <w:b w:val="0"/>
+          <w:color w:val="000000"/>
+          <w:sz w:val="23"/>
+        </w:rPr>
+        <w:t>Edmundo González</w:t>
+      </w:r>
     </w:p>
     <w:p>
       <w:pPr>
@@ -432,7 +448,7 @@
           <w:rFonts w:ascii="Arial" w:hAnsi="Arial"/>
           <w:b w:val="0"/>
           <w:color w:val="000000"/>
-          <w:sz w:val="24"/>
+          <w:sz w:val="23"/>
         </w:rPr>
         <w:t>Ing. Fimvark Guzmán Orozco</w:t>
       </w:r>
@@ -488,8 +504,9 @@
           <w:rFonts w:ascii="Arial" w:hAnsi="Arial"/>
           <w:i/>
           <w:color w:val="000000"/>
-        </w:rPr>
-        <w:t>León, Nicaragua — Octubre de 2026</w:t>
+          <w:sz w:val="22"/>
+        </w:rPr>
+        <w:t>4 de octubre de 2026</w:t>
       </w:r>
     </w:p>
     <w:p>
@@ -882,6 +899,11 @@
           <w:sz w:val="22"/>
         </w:rPr>
         <w:t>, valide la estructura y fechas, y comande el rechazo neumático de cualquier pieza ilegible. A continuación, se desarrolla la resolución técnica exhaustiva orientada a la ingeniería de OCR y procesamiento digital de imágenes.</w:t>
+      </w:r>
+    </w:p>
+    <w:p>
+      <w:r>
+        <w:br w:type="page"/>
       </w:r>
     </w:p>
     <w:p>
@@ -2185,6 +2207,11 @@
       </w:r>
     </w:p>
     <w:p>
+      <w:r>
+        <w:br w:type="page"/>
+      </w:r>
+    </w:p>
+    <w:p>
       <w:pPr>
         <w:keepNext/>
         <w:spacing w:before="400" w:after="80"/>
@@ -2627,6 +2654,11 @@
           <w:sz w:val="22"/>
         </w:rPr>
         <w:t>: si la empresa requiere acelerar la línea a 160 ppm, no es viable contratar más personal para mirar etiquetas. En términos económicos, detectar el defecto en las bodegas del distribuidor multiplicó los costos por 100 debido a la logística inversa y mermas por pérdida de cadena de frío.</w:t>
+      </w:r>
+    </w:p>
+    <w:p>
+      <w:r>
+        <w:br w:type="page"/>
       </w:r>
     </w:p>
     <w:p>
@@ -3557,7 +3589,7 @@
       <w:r>
         <w:drawing>
           <wp:inline xmlns:a="http://schemas.openxmlformats.org/drawingml/2006/main" xmlns:pic="http://schemas.openxmlformats.org/drawingml/2006/picture">
-            <wp:extent cx="5120640" cy="3342640"/>
+            <wp:extent cx="4937760" cy="3223260"/>
             <wp:docPr id="19" name="Picture 19"/>
             <wp:cNvGraphicFramePr>
               <a:graphicFrameLocks noChangeAspect="1"/>
@@ -3578,7 +3610,7 @@
                   <pic:spPr>
                     <a:xfrm>
                       <a:off x="0" y="0"/>
-                      <a:ext cx="5120640" cy="3342640"/>
+                      <a:ext cx="4937760" cy="3223260"/>
                     </a:xfrm>
                     <a:prstGeom prst="rect"/>
                   </pic:spPr>
@@ -3619,6 +3651,247 @@
     <w:p>
       <w:pPr>
         <w:keepNext/>
+        <w:spacing w:before="280" w:after="80"/>
+        <w:jc w:val="left"/>
+      </w:pPr>
+      <w:r>
+        <w:rPr>
+          <w:rFonts w:ascii="Arial" w:hAnsi="Arial"/>
+          <w:b/>
+          <w:color w:val="000000"/>
+          <w:sz w:val="23"/>
+        </w:rPr>
+        <w:t>Validación Cinemática Mediante Gemelo Digital 2D de la Línea y Pistón Neumático</w:t>
+      </w:r>
+    </w:p>
+    <w:p>
+      <w:pPr>
+        <w:spacing w:after="120" w:line="360" w:lineRule="auto"/>
+        <w:jc w:val="both"/>
+      </w:pPr>
+      <w:r>
+        <w:rPr>
+          <w:rFonts w:ascii="Arial" w:hAnsi="Arial"/>
+          <w:b w:val="0"/>
+          <w:color w:val="000000"/>
+          <w:sz w:val="22"/>
+        </w:rPr>
+        <w:t xml:space="preserve">Como fase previa y complementaria al montaje electromecánico en planta, se desarrolló un </w:t>
+      </w:r>
+      <w:r>
+        <w:rPr>
+          <w:rFonts w:ascii="Arial" w:hAnsi="Arial"/>
+          <w:b/>
+          <w:color w:val="000000"/>
+          <w:sz w:val="22"/>
+        </w:rPr>
+        <w:t>Gemelo Digital 2D interactivo</w:t>
+      </w:r>
+      <w:r>
+        <w:rPr>
+          <w:rFonts w:ascii="Arial" w:hAnsi="Arial"/>
+          <w:b w:val="0"/>
+          <w:color w:val="000000"/>
+          <w:sz w:val="22"/>
+        </w:rPr>
+        <w:t xml:space="preserve"> de la línea de empaque (Figura 7). Este entorno simula la cinemática continua de la cinta a </w:t>
+      </w:r>
+      <w:r>
+        <w:rPr>
+          <w:rFonts w:ascii="Arial" w:hAnsi="Arial"/>
+          <w:b/>
+          <w:color w:val="000000"/>
+          <w:sz w:val="22"/>
+        </w:rPr>
+        <w:t>1.20 m/s (120 ppm)</w:t>
+      </w:r>
+      <w:r>
+        <w:rPr>
+          <w:rFonts w:ascii="Arial" w:hAnsi="Arial"/>
+          <w:b w:val="0"/>
+          <w:color w:val="000000"/>
+          <w:sz w:val="22"/>
+        </w:rPr>
+        <w:t xml:space="preserve">, la interrupción del haz fotoeléctrico PNP, el destello estroboscópico sincronizado de </w:t>
+      </w:r>
+      <w:r>
+        <w:rPr>
+          <w:rFonts w:ascii="Arial" w:hAnsi="Arial"/>
+          <w:b/>
+          <w:color w:val="000000"/>
+          <w:sz w:val="22"/>
+        </w:rPr>
+        <w:t>500 μs</w:t>
+      </w:r>
+      <w:r>
+        <w:rPr>
+          <w:rFonts w:ascii="Arial" w:hAnsi="Arial"/>
+          <w:b w:val="0"/>
+          <w:color w:val="000000"/>
+          <w:sz w:val="22"/>
+        </w:rPr>
+        <w:t xml:space="preserve"> de la cámara CAM-01, la binarización de Otsu en tiempo real y la carrera de avance del cilindro neumático guiado </w:t>
+      </w:r>
+      <w:r>
+        <w:rPr>
+          <w:rFonts w:ascii="Arial" w:hAnsi="Arial"/>
+          <w:b/>
+          <w:color w:val="000000"/>
+          <w:sz w:val="22"/>
+        </w:rPr>
+        <w:t>FESTO DFM</w:t>
+      </w:r>
+      <w:r>
+        <w:rPr>
+          <w:rFonts w:ascii="Arial" w:hAnsi="Arial"/>
+          <w:b w:val="0"/>
+          <w:color w:val="000000"/>
+          <w:sz w:val="22"/>
+        </w:rPr>
+        <w:t xml:space="preserve"> en un tiempo de </w:t>
+      </w:r>
+      <w:r>
+        <w:rPr>
+          <w:rFonts w:ascii="Arial" w:hAnsi="Arial"/>
+          <w:b/>
+          <w:color w:val="000000"/>
+          <w:sz w:val="22"/>
+        </w:rPr>
+        <w:t>12 ms</w:t>
+      </w:r>
+      <w:r>
+        <w:rPr>
+          <w:rFonts w:ascii="Arial" w:hAnsi="Arial"/>
+          <w:b w:val="0"/>
+          <w:color w:val="000000"/>
+          <w:sz w:val="22"/>
+        </w:rPr>
+        <w:t xml:space="preserve">. La herramienta permite inyectar interactivamente las fallas reales del caso (pines quemados, tinta borrosa, caducidades vencidas y arrugas plásticas con reflejo especular), verificando que el actuador descarte físicamente las piezas defectuosas hacia la tolva de merma con un margen de seguridad temporal de </w:t>
+      </w:r>
+      <w:r>
+        <w:rPr>
+          <w:rFonts w:ascii="Arial" w:hAnsi="Arial"/>
+          <w:b/>
+          <w:color w:val="000000"/>
+          <w:sz w:val="22"/>
+        </w:rPr>
+        <w:t>4.05 veces</w:t>
+      </w:r>
+      <w:r>
+        <w:rPr>
+          <w:rFonts w:ascii="Arial" w:hAnsi="Arial"/>
+          <w:b w:val="0"/>
+          <w:color w:val="000000"/>
+          <w:sz w:val="22"/>
+        </w:rPr>
+        <w:t xml:space="preserve"> frente al tiempo de tránsito de 708 ms.</w:t>
+      </w:r>
+    </w:p>
+    <w:p>
+      <w:pPr>
+        <w:keepNext/>
+        <w:spacing w:before="280" w:after="40"/>
+      </w:pPr>
+      <w:r>
+        <w:rPr>
+          <w:rFonts w:ascii="Arial" w:hAnsi="Arial"/>
+          <w:b/>
+          <w:color w:val="000000"/>
+          <w:sz w:val="21"/>
+        </w:rPr>
+        <w:t>Figura 7</w:t>
+      </w:r>
+    </w:p>
+    <w:p>
+      <w:pPr>
+        <w:keepNext/>
+        <w:spacing w:after="120"/>
+      </w:pPr>
+      <w:r>
+        <w:rPr>
+          <w:rFonts w:ascii="Arial" w:hAnsi="Arial"/>
+          <w:i/>
+          <w:color w:val="000000"/>
+          <w:sz w:val="21"/>
+        </w:rPr>
+        <w:t>Gemelo Digital 2D: Simulación Cinemática de la Cinta Transportadora y Pistón Neumático FESTO DFM</w:t>
+      </w:r>
+    </w:p>
+    <w:p>
+      <w:pPr>
+        <w:spacing w:before="80" w:after="80"/>
+        <w:jc w:val="center"/>
+      </w:pPr>
+    </w:p>
+    <w:p>
+      <w:pPr>
+        <w:jc w:val="center"/>
+      </w:pPr>
+      <w:r>
+        <w:drawing>
+          <wp:inline xmlns:a="http://schemas.openxmlformats.org/drawingml/2006/main" xmlns:pic="http://schemas.openxmlformats.org/drawingml/2006/picture">
+            <wp:extent cx="4937760" cy="4906017"/>
+            <wp:docPr id="20" name="Picture 20"/>
+            <wp:cNvGraphicFramePr>
+              <a:graphicFrameLocks noChangeAspect="1"/>
+            </wp:cNvGraphicFramePr>
+            <a:graphic>
+              <a:graphicData uri="http://schemas.openxmlformats.org/drawingml/2006/picture">
+                <pic:pic>
+                  <pic:nvPicPr>
+                    <pic:cNvPr id="0" name="fig_simulador_2d.png"/>
+                    <pic:cNvPicPr/>
+                  </pic:nvPicPr>
+                  <pic:blipFill>
+                    <a:blip r:embed="rId22"/>
+                    <a:stretch>
+                      <a:fillRect/>
+                    </a:stretch>
+                  </pic:blipFill>
+                  <pic:spPr>
+                    <a:xfrm>
+                      <a:off x="0" y="0"/>
+                      <a:ext cx="4937760" cy="4906017"/>
+                    </a:xfrm>
+                    <a:prstGeom prst="rect"/>
+                  </pic:spPr>
+                </pic:pic>
+              </a:graphicData>
+            </a:graphic>
+          </wp:inline>
+        </w:drawing>
+      </w:r>
+    </w:p>
+    <w:p>
+      <w:pPr>
+        <w:spacing w:before="80" w:after="240" w:line="276" w:lineRule="auto"/>
+      </w:pPr>
+      <w:r>
+        <w:rPr>
+          <w:rFonts w:ascii="Arial" w:hAnsi="Arial"/>
+          <w:i/>
+          <w:color w:val="000000"/>
+          <w:sz w:val="18"/>
+        </w:rPr>
+        <w:t xml:space="preserve">Nota. </w:t>
+      </w:r>
+      <w:r>
+        <w:rPr>
+          <w:rFonts w:ascii="Arial" w:hAnsi="Arial"/>
+          <w:color w:val="000000"/>
+          <w:sz w:val="18"/>
+        </w:rPr>
+        <w:t>Entorno interactivo 2D donde se modela la cinemática continua a 1.2 m/s, la captura estroboscópica por la cámara CAM-01, la binarización en tiempo real y la expulsión lateral de paquetes con defectos hacia la tolva de mermas.</w:t>
+      </w:r>
+    </w:p>
+    <w:p>
+      <w:r>
+        <w:br w:type="page"/>
+      </w:r>
+    </w:p>
+    <w:p>
+      <w:pPr>
+        <w:keepNext/>
         <w:spacing w:before="400" w:after="80"/>
         <w:jc w:val="center"/>
       </w:pPr>
@@ -3703,7 +3976,7 @@
           <w:color w:val="000000"/>
           <w:sz w:val="21"/>
         </w:rPr>
-        <w:t>Figura 7</w:t>
+        <w:t>Figura 8</w:t>
       </w:r>
     </w:p>
     <w:p>
@@ -3734,8 +4007,8 @@
       <w:r>
         <w:drawing>
           <wp:inline xmlns:a="http://schemas.openxmlformats.org/drawingml/2006/main" xmlns:pic="http://schemas.openxmlformats.org/drawingml/2006/picture">
-            <wp:extent cx="3108960" cy="7839621"/>
-            <wp:docPr id="20" name="Picture 20"/>
+            <wp:extent cx="1965960" cy="4957407"/>
+            <wp:docPr id="21" name="Picture 21"/>
             <wp:cNvGraphicFramePr>
               <a:graphicFrameLocks noChangeAspect="1"/>
             </wp:cNvGraphicFramePr>
@@ -3747,7 +4020,7 @@
                     <pic:cNvPicPr/>
                   </pic:nvPicPr>
                   <pic:blipFill>
-                    <a:blip r:embed="rId22"/>
+                    <a:blip r:embed="rId23"/>
                     <a:stretch>
                       <a:fillRect/>
                     </a:stretch>
@@ -3755,7 +4028,7 @@
                   <pic:spPr>
                     <a:xfrm>
                       <a:off x="0" y="0"/>
-                      <a:ext cx="3108960" cy="7839621"/>
+                      <a:ext cx="1965960" cy="4957407"/>
                     </a:xfrm>
                     <a:prstGeom prst="rect"/>
                   </pic:spPr>
@@ -3789,6 +4062,27 @@
       </w:r>
     </w:p>
     <w:p>
+      <w:r>
+        <w:br w:type="page"/>
+      </w:r>
+    </w:p>
+    <w:p>
+      <w:pPr>
+        <w:keepNext/>
+        <w:spacing w:before="280" w:after="80"/>
+        <w:jc w:val="left"/>
+      </w:pPr>
+      <w:r>
+        <w:rPr>
+          <w:rFonts w:ascii="Arial" w:hAnsi="Arial"/>
+          <w:b/>
+          <w:color w:val="000000"/>
+          <w:sz w:val="23"/>
+        </w:rPr>
+        <w:t>Análisis de Inferencia Neuronal (LSTM) y Extracción de Bounding Boxes</w:t>
+      </w:r>
+    </w:p>
+    <w:p>
       <w:pPr>
         <w:spacing w:after="120" w:line="360" w:lineRule="auto"/>
         <w:jc w:val="both"/>
@@ -3800,7 +4094,7 @@
           <w:color w:val="000000"/>
           <w:sz w:val="22"/>
         </w:rPr>
-        <w:t>Para profundizar en el funcionamiento interno del clasificador neuronal, la Figura 8 desglosa la extracción a nivel de Bounding Boxes individuales y la distribución Softmax de probabilidades, contrastando el caso de una etiqueta conforme frente al colapso de confianza provocado por la falla de cabezal:</w:t>
+        <w:t>Para profundizar en el funcionamiento interno del clasificador neuronal, la Figura 9 desglosa la extracción a nivel de Bounding Boxes individuales y la distribución Softmax de probabilidades, contrastando el caso de una etiqueta conforme frente al colapso de confianza provocado por la falla de cabezal:</w:t>
       </w:r>
     </w:p>
     <w:p>
@@ -3815,7 +4109,7 @@
           <w:color w:val="000000"/>
           <w:sz w:val="21"/>
         </w:rPr>
-        <w:t>Figura 8</w:t>
+        <w:t>Figura 9</w:t>
       </w:r>
     </w:p>
     <w:p>
@@ -3846,8 +4140,8 @@
       <w:r>
         <w:drawing>
           <wp:inline xmlns:a="http://schemas.openxmlformats.org/drawingml/2006/main" xmlns:pic="http://schemas.openxmlformats.org/drawingml/2006/picture">
-            <wp:extent cx="5120640" cy="2218944"/>
-            <wp:docPr id="21" name="Picture 21"/>
+            <wp:extent cx="4937760" cy="2139696"/>
+            <wp:docPr id="22" name="Picture 22"/>
             <wp:cNvGraphicFramePr>
               <a:graphicFrameLocks noChangeAspect="1"/>
             </wp:cNvGraphicFramePr>
@@ -3859,7 +4153,7 @@
                     <pic:cNvPicPr/>
                   </pic:nvPicPr>
                   <pic:blipFill>
-                    <a:blip r:embed="rId23"/>
+                    <a:blip r:embed="rId24"/>
                     <a:stretch>
                       <a:fillRect/>
                     </a:stretch>
@@ -3867,7 +4161,7 @@
                   <pic:spPr>
                     <a:xfrm>
                       <a:off x="0" y="0"/>
-                      <a:ext cx="5120640" cy="2218944"/>
+                      <a:ext cx="4937760" cy="2139696"/>
                     </a:xfrm>
                     <a:prstGeom prst="rect"/>
                   </pic:spPr>
@@ -3912,7 +4206,7 @@
           <w:color w:val="000000"/>
           <w:sz w:val="22"/>
         </w:rPr>
-        <w:t>El flujo lógico detallado en las Figuras 7 y 8 se ejecuta siguiendo la siguiente secuencia de pasos operativos:</w:t>
+        <w:t>El flujo lógico detallado en las Figuras 8 y 9 se ejecuta siguiendo la siguiente secuencia de pasos operativos:</w:t>
       </w:r>
     </w:p>
     <w:p>
@@ -4783,7 +5077,7 @@
           <w:color w:val="000000"/>
           <w:sz w:val="22"/>
         </w:rPr>
-        <w:t>En la Figura 9 se aprecia la respuesta inmediata de la interfaz ante un caso de producto rechazado por caracteres borrosos, mostrando la activación de la señal PLC de 24V y la alarma sonora en planta:</w:t>
+        <w:t>En la Figura 10 se aprecia la respuesta inmediata de la interfaz ante un caso de producto rechazado por caracteres borrosos, mostrando la activación de la señal PLC de 24V y la alarma sonora en planta:</w:t>
       </w:r>
     </w:p>
     <w:p>
@@ -4798,7 +5092,7 @@
           <w:color w:val="000000"/>
           <w:sz w:val="21"/>
         </w:rPr>
-        <w:t>Figura 9</w:t>
+        <w:t>Figura 10</w:t>
       </w:r>
     </w:p>
     <w:p>
@@ -4829,8 +5123,8 @@
       <w:r>
         <w:drawing>
           <wp:inline xmlns:a="http://schemas.openxmlformats.org/drawingml/2006/main" xmlns:pic="http://schemas.openxmlformats.org/drawingml/2006/picture">
-            <wp:extent cx="5120640" cy="3342640"/>
-            <wp:docPr id="22" name="Picture 22"/>
+            <wp:extent cx="4937760" cy="3223260"/>
+            <wp:docPr id="23" name="Picture 23"/>
             <wp:cNvGraphicFramePr>
               <a:graphicFrameLocks noChangeAspect="1"/>
             </wp:cNvGraphicFramePr>
@@ -4842,7 +5136,7 @@
                     <pic:cNvPicPr/>
                   </pic:nvPicPr>
                   <pic:blipFill>
-                    <a:blip r:embed="rId24"/>
+                    <a:blip r:embed="rId25"/>
                     <a:stretch>
                       <a:fillRect/>
                     </a:stretch>
@@ -4850,7 +5144,7 @@
                   <pic:spPr>
                     <a:xfrm>
                       <a:off x="0" y="0"/>
-                      <a:ext cx="5120640" cy="3342640"/>
+                      <a:ext cx="4937760" cy="3223260"/>
                     </a:xfrm>
                     <a:prstGeom prst="rect"/>
                   </pic:spPr>
@@ -4884,6 +5178,11 @@
       </w:r>
     </w:p>
     <w:p>
+      <w:r>
+        <w:br w:type="page"/>
+      </w:r>
+    </w:p>
+    <w:p>
       <w:pPr>
         <w:keepNext/>
         <w:spacing w:before="400" w:after="80"/>
@@ -5191,7 +5490,7 @@
           <w:color w:val="000000"/>
           <w:sz w:val="22"/>
         </w:rPr>
-        <w:t>: se asume una tasa de falsos rechazos de 0.2% en tolva antes que permitir un solo escape defectuoso al mercado. El índice de confianza global de la cadena se calcula según la Ecuación 3:</w:t>
+        <w:t>: se asume una tasa de falsos rechazos de 0.2% en tolva antes que permitir un solo escape defectuoso al mercado. El índice de confianza global de la cadena se calcula según la Ecuación 5:</w:t>
       </w:r>
     </w:p>
     <w:tbl>
@@ -5337,7 +5636,7 @@
           <w:color w:val="000000"/>
           <w:sz w:val="22"/>
         </w:rPr>
-        <w:t xml:space="preserve"> es la probabilidad Softmax de cada carácter y </w:t>
+        <w:t xml:space="preserve"> es la probabilidad Softmax de cada carácter individual y </w:t>
       </w:r>
       <w:r>
         <w:rPr>
@@ -5406,7 +5705,7 @@
           <w:color w:val="000000"/>
           <w:sz w:val="22"/>
         </w:rPr>
-        <w:t>Las Figuras 10 y 11 exhiben la implementación de la aplicación en dispositivos móviles Android Chrome, mostrando la captura del sensor y la alarma de rechazo:</w:t>
+        <w:t>Las Figuras 11 y 12 exhiben la implementación de la aplicación en dispositivos móviles Android Chrome, mostrando la captura del sensor y la alarma de rechazo:</w:t>
       </w:r>
     </w:p>
     <w:p>
@@ -5421,7 +5720,7 @@
           <w:color w:val="000000"/>
           <w:sz w:val="21"/>
         </w:rPr>
-        <w:t>Figura 10</w:t>
+        <w:t>Figura 11</w:t>
       </w:r>
     </w:p>
     <w:p>
@@ -5452,8 +5751,8 @@
       <w:r>
         <w:drawing>
           <wp:inline xmlns:a="http://schemas.openxmlformats.org/drawingml/2006/main" xmlns:pic="http://schemas.openxmlformats.org/drawingml/2006/picture">
-            <wp:extent cx="2743200" cy="5936566"/>
-            <wp:docPr id="23" name="Picture 23"/>
+            <wp:extent cx="2651760" cy="5738681"/>
+            <wp:docPr id="24" name="Picture 24"/>
             <wp:cNvGraphicFramePr>
               <a:graphicFrameLocks noChangeAspect="1"/>
             </wp:cNvGraphicFramePr>
@@ -5465,7 +5764,7 @@
                     <pic:cNvPicPr/>
                   </pic:nvPicPr>
                   <pic:blipFill>
-                    <a:blip r:embed="rId25"/>
+                    <a:blip r:embed="rId26"/>
                     <a:stretch>
                       <a:fillRect/>
                     </a:stretch>
@@ -5473,7 +5772,7 @@
                   <pic:spPr>
                     <a:xfrm>
                       <a:off x="0" y="0"/>
-                      <a:ext cx="2743200" cy="5936566"/>
+                      <a:ext cx="2651760" cy="5738681"/>
                     </a:xfrm>
                     <a:prstGeom prst="rect"/>
                   </pic:spPr>
@@ -5518,7 +5817,7 @@
           <w:color w:val="000000"/>
           <w:sz w:val="21"/>
         </w:rPr>
-        <w:t>Figura 11</w:t>
+        <w:t>Figura 12</w:t>
       </w:r>
     </w:p>
     <w:p>
@@ -5549,8 +5848,8 @@
       <w:r>
         <w:drawing>
           <wp:inline xmlns:a="http://schemas.openxmlformats.org/drawingml/2006/main" xmlns:pic="http://schemas.openxmlformats.org/drawingml/2006/picture">
-            <wp:extent cx="2743200" cy="5936566"/>
-            <wp:docPr id="24" name="Picture 24"/>
+            <wp:extent cx="2651760" cy="5738681"/>
+            <wp:docPr id="25" name="Picture 25"/>
             <wp:cNvGraphicFramePr>
               <a:graphicFrameLocks noChangeAspect="1"/>
             </wp:cNvGraphicFramePr>
@@ -5562,7 +5861,7 @@
                     <pic:cNvPicPr/>
                   </pic:nvPicPr>
                   <pic:blipFill>
-                    <a:blip r:embed="rId26"/>
+                    <a:blip r:embed="rId27"/>
                     <a:stretch>
                       <a:fillRect/>
                     </a:stretch>
@@ -5570,7 +5869,7 @@
                   <pic:spPr>
                     <a:xfrm>
                       <a:off x="0" y="0"/>
-                      <a:ext cx="2743200" cy="5936566"/>
+                      <a:ext cx="2651760" cy="5738681"/>
                     </a:xfrm>
                     <a:prstGeom prst="rect"/>
                   </pic:spPr>
@@ -5615,7 +5914,7 @@
           <w:color w:val="000000"/>
           <w:sz w:val="22"/>
         </w:rPr>
-        <w:t>Por último, la Figura 12 muestra el Estudio Web Interactivo (`generador.html`) programado para simular fallas térmicas y deformaciones plásticas:</w:t>
+        <w:t>Por último, la Figura 13 muestra el Estudio Web Interactivo (`generador.html`) programado para simular fallas térmicas y deformaciones plásticas:</w:t>
       </w:r>
     </w:p>
     <w:p>
@@ -5630,7 +5929,7 @@
           <w:color w:val="000000"/>
           <w:sz w:val="21"/>
         </w:rPr>
-        <w:t>Figura 12</w:t>
+        <w:t>Figura 13</w:t>
       </w:r>
     </w:p>
     <w:p>
@@ -5661,8 +5960,8 @@
       <w:r>
         <w:drawing>
           <wp:inline xmlns:a="http://schemas.openxmlformats.org/drawingml/2006/main" xmlns:pic="http://schemas.openxmlformats.org/drawingml/2006/picture">
-            <wp:extent cx="5120640" cy="3342640"/>
-            <wp:docPr id="25" name="Picture 25"/>
+            <wp:extent cx="4937760" cy="3223260"/>
+            <wp:docPr id="26" name="Picture 26"/>
             <wp:cNvGraphicFramePr>
               <a:graphicFrameLocks noChangeAspect="1"/>
             </wp:cNvGraphicFramePr>
@@ -5674,7 +5973,7 @@
                     <pic:cNvPicPr/>
                   </pic:nvPicPr>
                   <pic:blipFill>
-                    <a:blip r:embed="rId27"/>
+                    <a:blip r:embed="rId28"/>
                     <a:stretch>
                       <a:fillRect/>
                     </a:stretch>
@@ -5682,7 +5981,7 @@
                   <pic:spPr>
                     <a:xfrm>
                       <a:off x="0" y="0"/>
-                      <a:ext cx="5120640" cy="3342640"/>
+                      <a:ext cx="4937760" cy="3223260"/>
                     </a:xfrm>
                     <a:prstGeom prst="rect"/>
                   </pic:spPr>
@@ -5716,6 +6015,11 @@
       </w:r>
     </w:p>
     <w:p>
+      <w:r>
+        <w:br w:type="page"/>
+      </w:r>
+    </w:p>
+    <w:p>
       <w:pPr>
         <w:keepNext/>
         <w:spacing w:before="400" w:after="80"/>
@@ -5846,6 +6150,44 @@
           <w:sz w:val="22"/>
         </w:rPr>
         <w:t xml:space="preserve"> y la fijación del umbral de confianza global en C_global ≥ 60% garantizan que ningún producto con fecha caducada o borrosa alcance los supermercados, blindando a la empresa frente a sanciones legales y multas de salud pública.</w:t>
+      </w:r>
+    </w:p>
+    <w:p>
+      <w:pPr>
+        <w:spacing w:after="120" w:line="360" w:lineRule="auto"/>
+        <w:jc w:val="both"/>
+      </w:pPr>
+      <w:r>
+        <w:rPr>
+          <w:rFonts w:ascii="Arial" w:hAnsi="Arial"/>
+          <w:b w:val="0"/>
+          <w:color w:val="000000"/>
+          <w:sz w:val="22"/>
+        </w:rPr>
+        <w:t xml:space="preserve">4. La integración y modelado cinemático mediante el </w:t>
+      </w:r>
+      <w:r>
+        <w:rPr>
+          <w:rFonts w:ascii="Arial" w:hAnsi="Arial"/>
+          <w:b/>
+          <w:color w:val="000000"/>
+          <w:sz w:val="22"/>
+        </w:rPr>
+        <w:t>Gemelo Digital 2D interactivo</w:t>
+      </w:r>
+      <w:r>
+        <w:rPr>
+          <w:rFonts w:ascii="Arial" w:hAnsi="Arial"/>
+          <w:b w:val="0"/>
+          <w:color w:val="000000"/>
+          <w:sz w:val="22"/>
+        </w:rPr>
+        <w:t xml:space="preserve"> de la línea de empaque y el actuador neumático FESTO DFM permitió verificar previamente al montaje físico el factor de seguridad temporal (4.05 veces mayor a los 175 ms de latencia), validando la sincronización estroboscópica y la expulsión lateral de mermas a 1.2 m/s.</w:t>
+      </w:r>
+    </w:p>
+    <w:p>
+      <w:r>
+        <w:br w:type="page"/>
       </w:r>
     </w:p>
     <w:p>

</xml_diff>